<commit_message>
se agraga la linea de unan solicitada  y se rellenan las tablas
</commit_message>
<xml_diff>
--- a/Base de Datos I(Yesenia Tellez)/semana 3.docx
+++ b/Base de Datos I(Yesenia Tellez)/semana 3.docx
@@ -10,6 +10,14 @@
           <w:bCs/>
         </w:rPr>
       </w:pPr>
+      <w:r>
+        <w:rPr>
+          <w:rFonts w:ascii="Arial Narrow" w:hAnsi="Arial Narrow" w:cs="Times New Roman"/>
+          <w:b/>
+          <w:bCs/>
+        </w:rPr>
+        <w:t xml:space="preserve"> </w:t>
+      </w:r>
       <w:r>
         <w:rPr>
           <w:rFonts w:ascii="Arial Narrow" w:hAnsi="Arial Narrow" w:cs="Times New Roman"/>

</xml_diff>